<commit_message>
Marca: rodada 2 de nomes com os tres sinais cannabis+tecnologia+saude
Dez nomes construidos e pontuados por sinal, mais a recomendacao de nome
distintivo com descritor de categoria.

Co-Authored-By: Claude <noreply@anthropic.com>
Claude-Session: https://claude.ai/code/session_018WZd4PZy53xqMaYcFDrxLe
</commit_message>
<xml_diff>
--- a/docs/cannabis/ESTUDO_NOMES_MARCA.docx
+++ b/docs/cannabis/ESTUDO_NOMES_MARCA.docx
@@ -685,6 +685,943 @@
       </w:r>
       <w:r>
         <w:t xml:space="preserve">Checagens objetivas: INPI (4 classes), dominio .com.br disponivel, handle livre em Instagram/LinkedIn, resultado de busca do nome sem associacoes ruins.</w:t>
+      </w:r>
+    </w:p>
+    <w:p>
+      <w:pPr>
+        <w:pStyle w:val="Heading1"/>
+        <w:jc w:val="center"/>
+      </w:pPr>
+      <w:r>
+        <w:rPr>
+          <w:b/>
+          <w:bCs/>
+        </w:rPr>
+        <w:t xml:space="preserve">Rodada 2 — pedido do dono: o nome tem que soar cannabis + tecnologia + saude</w:t>
+      </w:r>
+    </w:p>
+    <w:p>
+      <w:pPr>
+        <w:spacing w:after="160"/>
+        <w:jc w:val="both"/>
+      </w:pPr>
+      <w:r>
+        <w:t xml:space="preserve">Nomes construidos para carregar os tres sinais ao mesmo tempo. Legenda de forca por sinal (alto/medio/baixo) e a ressalva da Lente 8: quanto mais explicito o "cann", maior o atrito em anuncios, pagamentos e INPI.</w:t>
+      </w:r>
+    </w:p>
+    <w:tbl>
+      <w:tblPr>
+        <w:tblW w:type="dxa" w:w="9360"/>
+        <w:tblBorders>
+          <w:top w:val="single" w:color="auto" w:sz="4"/>
+          <w:left w:val="single" w:color="auto" w:sz="4"/>
+          <w:bottom w:val="single" w:color="auto" w:sz="4"/>
+          <w:right w:val="single" w:color="auto" w:sz="4"/>
+          <w:insideH w:val="single" w:color="auto" w:sz="4"/>
+          <w:insideV w:val="single" w:color="auto" w:sz="4"/>
+        </w:tblBorders>
+      </w:tblPr>
+      <w:tblGrid>
+        <w:gridCol w:w="1872"/>
+        <w:gridCol w:w="1872"/>
+        <w:gridCol w:w="1872"/>
+        <w:gridCol w:w="1872"/>
+        <w:gridCol w:w="1872"/>
+      </w:tblGrid>
+      <w:tr>
+        <w:tc>
+          <w:tcPr>
+            <w:tcW w:type="dxa" w:w="1872"/>
+          </w:tcPr>
+          <w:p>
+            <w:r>
+              <w:rPr>
+                <w:b/>
+                <w:bCs/>
+              </w:rPr>
+              <w:t xml:space="preserve">Nome</w:t>
+            </w:r>
+          </w:p>
+        </w:tc>
+        <w:tc>
+          <w:tcPr>
+            <w:tcW w:type="dxa" w:w="1872"/>
+          </w:tcPr>
+          <w:p>
+            <w:r>
+              <w:rPr>
+                <w:b/>
+                <w:bCs/>
+              </w:rPr>
+              <w:t xml:space="preserve">Construcao</w:t>
+            </w:r>
+          </w:p>
+        </w:tc>
+        <w:tc>
+          <w:tcPr>
+            <w:tcW w:type="dxa" w:w="1872"/>
+          </w:tcPr>
+          <w:p>
+            <w:r>
+              <w:rPr>
+                <w:b/>
+                <w:bCs/>
+              </w:rPr>
+              <w:t xml:space="preserve">Cannabis</w:t>
+            </w:r>
+          </w:p>
+        </w:tc>
+        <w:tc>
+          <w:tcPr>
+            <w:tcW w:type="dxa" w:w="1872"/>
+          </w:tcPr>
+          <w:p>
+            <w:r>
+              <w:rPr>
+                <w:b/>
+                <w:bCs/>
+              </w:rPr>
+              <w:t xml:space="preserve">Tecnologia</w:t>
+            </w:r>
+          </w:p>
+        </w:tc>
+        <w:tc>
+          <w:tcPr>
+            <w:tcW w:type="dxa" w:w="1872"/>
+          </w:tcPr>
+          <w:p>
+            <w:r>
+              <w:rPr>
+                <w:b/>
+                <w:bCs/>
+              </w:rPr>
+              <w:t xml:space="preserve">Saude</w:t>
+            </w:r>
+          </w:p>
+        </w:tc>
+      </w:tr>
+      <w:tr>
+        <w:tc>
+          <w:tcPr>
+            <w:tcW w:type="dxa" w:w="1872"/>
+          </w:tcPr>
+          <w:p>
+            <w:r>
+              <w:rPr>
+                <w:b w:val="false"/>
+                <w:bCs w:val="false"/>
+              </w:rPr>
+              <w:t xml:space="preserve">Canapia</w:t>
+            </w:r>
+          </w:p>
+        </w:tc>
+        <w:tc>
+          <w:tcPr>
+            <w:tcW w:type="dxa" w:w="1872"/>
+          </w:tcPr>
+          <w:p>
+            <w:r>
+              <w:rPr>
+                <w:b w:val="false"/>
+                <w:bCs w:val="false"/>
+              </w:rPr>
+              <w:t xml:space="preserve">canna + terapia</w:t>
+            </w:r>
+          </w:p>
+        </w:tc>
+        <w:tc>
+          <w:tcPr>
+            <w:tcW w:type="dxa" w:w="1872"/>
+          </w:tcPr>
+          <w:p>
+            <w:r>
+              <w:rPr>
+                <w:b w:val="false"/>
+                <w:bCs w:val="false"/>
+              </w:rPr>
+              <w:t xml:space="preserve">alto</w:t>
+            </w:r>
+          </w:p>
+        </w:tc>
+        <w:tc>
+          <w:tcPr>
+            <w:tcW w:type="dxa" w:w="1872"/>
+          </w:tcPr>
+          <w:p>
+            <w:r>
+              <w:rPr>
+                <w:b w:val="false"/>
+                <w:bCs w:val="false"/>
+              </w:rPr>
+              <w:t xml:space="preserve">medio</w:t>
+            </w:r>
+          </w:p>
+        </w:tc>
+        <w:tc>
+          <w:tcPr>
+            <w:tcW w:type="dxa" w:w="1872"/>
+          </w:tcPr>
+          <w:p>
+            <w:r>
+              <w:rPr>
+                <w:b w:val="false"/>
+                <w:bCs w:val="false"/>
+              </w:rPr>
+              <w:t xml:space="preserve">alto</w:t>
+            </w:r>
+          </w:p>
+        </w:tc>
+      </w:tr>
+      <w:tr>
+        <w:tc>
+          <w:tcPr>
+            <w:tcW w:type="dxa" w:w="1872"/>
+          </w:tcPr>
+          <w:p>
+            <w:r>
+              <w:rPr>
+                <w:b w:val="false"/>
+                <w:bCs w:val="false"/>
+              </w:rPr>
+              <w:t xml:space="preserve">Cannalis</w:t>
+            </w:r>
+          </w:p>
+        </w:tc>
+        <w:tc>
+          <w:tcPr>
+            <w:tcW w:type="dxa" w:w="1872"/>
+          </w:tcPr>
+          <w:p>
+            <w:r>
+              <w:rPr>
+                <w:b w:val="false"/>
+                <w:bCs w:val="false"/>
+              </w:rPr>
+              <w:t xml:space="preserve">canna + analise</w:t>
+            </w:r>
+          </w:p>
+        </w:tc>
+        <w:tc>
+          <w:tcPr>
+            <w:tcW w:type="dxa" w:w="1872"/>
+          </w:tcPr>
+          <w:p>
+            <w:r>
+              <w:rPr>
+                <w:b w:val="false"/>
+                <w:bCs w:val="false"/>
+              </w:rPr>
+              <w:t xml:space="preserve">alto</w:t>
+            </w:r>
+          </w:p>
+        </w:tc>
+        <w:tc>
+          <w:tcPr>
+            <w:tcW w:type="dxa" w:w="1872"/>
+          </w:tcPr>
+          <w:p>
+            <w:r>
+              <w:rPr>
+                <w:b w:val="false"/>
+                <w:bCs w:val="false"/>
+              </w:rPr>
+              <w:t xml:space="preserve">alto</w:t>
+            </w:r>
+          </w:p>
+        </w:tc>
+        <w:tc>
+          <w:tcPr>
+            <w:tcW w:type="dxa" w:w="1872"/>
+          </w:tcPr>
+          <w:p>
+            <w:r>
+              <w:rPr>
+                <w:b w:val="false"/>
+                <w:bCs w:val="false"/>
+              </w:rPr>
+              <w:t xml:space="preserve">medio</w:t>
+            </w:r>
+          </w:p>
+        </w:tc>
+      </w:tr>
+      <w:tr>
+        <w:tc>
+          <w:tcPr>
+            <w:tcW w:type="dxa" w:w="1872"/>
+          </w:tcPr>
+          <w:p>
+            <w:r>
+              <w:rPr>
+                <w:b w:val="false"/>
+                <w:bCs w:val="false"/>
+              </w:rPr>
+              <w:t xml:space="preserve">Sativia</w:t>
+            </w:r>
+          </w:p>
+        </w:tc>
+        <w:tc>
+          <w:tcPr>
+            <w:tcW w:type="dxa" w:w="1872"/>
+          </w:tcPr>
+          <w:p>
+            <w:r>
+              <w:rPr>
+                <w:b w:val="false"/>
+                <w:bCs w:val="false"/>
+              </w:rPr>
+              <w:t xml:space="preserve">sativa + -ia</w:t>
+            </w:r>
+          </w:p>
+        </w:tc>
+        <w:tc>
+          <w:tcPr>
+            <w:tcW w:type="dxa" w:w="1872"/>
+          </w:tcPr>
+          <w:p>
+            <w:r>
+              <w:rPr>
+                <w:b w:val="false"/>
+                <w:bCs w:val="false"/>
+              </w:rPr>
+              <w:t xml:space="preserve">alto</w:t>
+            </w:r>
+          </w:p>
+        </w:tc>
+        <w:tc>
+          <w:tcPr>
+            <w:tcW w:type="dxa" w:w="1872"/>
+          </w:tcPr>
+          <w:p>
+            <w:r>
+              <w:rPr>
+                <w:b w:val="false"/>
+                <w:bCs w:val="false"/>
+              </w:rPr>
+              <w:t xml:space="preserve">medio</w:t>
+            </w:r>
+          </w:p>
+        </w:tc>
+        <w:tc>
+          <w:tcPr>
+            <w:tcW w:type="dxa" w:w="1872"/>
+          </w:tcPr>
+          <w:p>
+            <w:r>
+              <w:rPr>
+                <w:b w:val="false"/>
+                <w:bCs w:val="false"/>
+              </w:rPr>
+              <w:t xml:space="preserve">medio</w:t>
+            </w:r>
+          </w:p>
+        </w:tc>
+      </w:tr>
+      <w:tr>
+        <w:tc>
+          <w:tcPr>
+            <w:tcW w:type="dxa" w:w="1872"/>
+          </w:tcPr>
+          <w:p>
+            <w:r>
+              <w:rPr>
+                <w:b w:val="false"/>
+                <w:bCs w:val="false"/>
+              </w:rPr>
+              <w:t xml:space="preserve">Verdegen</w:t>
+            </w:r>
+          </w:p>
+        </w:tc>
+        <w:tc>
+          <w:tcPr>
+            <w:tcW w:type="dxa" w:w="1872"/>
+          </w:tcPr>
+          <w:p>
+            <w:r>
+              <w:rPr>
+                <w:b w:val="false"/>
+                <w:bCs w:val="false"/>
+              </w:rPr>
+              <w:t xml:space="preserve">verde + genetica</w:t>
+            </w:r>
+          </w:p>
+        </w:tc>
+        <w:tc>
+          <w:tcPr>
+            <w:tcW w:type="dxa" w:w="1872"/>
+          </w:tcPr>
+          <w:p>
+            <w:r>
+              <w:rPr>
+                <w:b w:val="false"/>
+                <w:bCs w:val="false"/>
+              </w:rPr>
+              <w:t xml:space="preserve">medio</w:t>
+            </w:r>
+          </w:p>
+        </w:tc>
+        <w:tc>
+          <w:tcPr>
+            <w:tcW w:type="dxa" w:w="1872"/>
+          </w:tcPr>
+          <w:p>
+            <w:r>
+              <w:rPr>
+                <w:b w:val="false"/>
+                <w:bCs w:val="false"/>
+              </w:rPr>
+              <w:t xml:space="preserve">alto</w:t>
+            </w:r>
+          </w:p>
+        </w:tc>
+        <w:tc>
+          <w:tcPr>
+            <w:tcW w:type="dxa" w:w="1872"/>
+          </w:tcPr>
+          <w:p>
+            <w:r>
+              <w:rPr>
+                <w:b w:val="false"/>
+                <w:bCs w:val="false"/>
+              </w:rPr>
+              <w:t xml:space="preserve">medio</w:t>
+            </w:r>
+          </w:p>
+        </w:tc>
+      </w:tr>
+      <w:tr>
+        <w:tc>
+          <w:tcPr>
+            <w:tcW w:type="dxa" w:w="1872"/>
+          </w:tcPr>
+          <w:p>
+            <w:r>
+              <w:rPr>
+                <w:b w:val="false"/>
+                <w:bCs w:val="false"/>
+              </w:rPr>
+              <w:t xml:space="preserve">Cannexa</w:t>
+            </w:r>
+          </w:p>
+        </w:tc>
+        <w:tc>
+          <w:tcPr>
+            <w:tcW w:type="dxa" w:w="1872"/>
+          </w:tcPr>
+          <w:p>
+            <w:r>
+              <w:rPr>
+                <w:b w:val="false"/>
+                <w:bCs w:val="false"/>
+              </w:rPr>
+              <w:t xml:space="preserve">canna + nexo (plataforma que conecta)</w:t>
+            </w:r>
+          </w:p>
+        </w:tc>
+        <w:tc>
+          <w:tcPr>
+            <w:tcW w:type="dxa" w:w="1872"/>
+          </w:tcPr>
+          <w:p>
+            <w:r>
+              <w:rPr>
+                <w:b w:val="false"/>
+                <w:bCs w:val="false"/>
+              </w:rPr>
+              <w:t xml:space="preserve">alto</w:t>
+            </w:r>
+          </w:p>
+        </w:tc>
+        <w:tc>
+          <w:tcPr>
+            <w:tcW w:type="dxa" w:w="1872"/>
+          </w:tcPr>
+          <w:p>
+            <w:r>
+              <w:rPr>
+                <w:b w:val="false"/>
+                <w:bCs w:val="false"/>
+              </w:rPr>
+              <w:t xml:space="preserve">alto</w:t>
+            </w:r>
+          </w:p>
+        </w:tc>
+        <w:tc>
+          <w:tcPr>
+            <w:tcW w:type="dxa" w:w="1872"/>
+          </w:tcPr>
+          <w:p>
+            <w:r>
+              <w:rPr>
+                <w:b w:val="false"/>
+                <w:bCs w:val="false"/>
+              </w:rPr>
+              <w:t xml:space="preserve">baixo</w:t>
+            </w:r>
+          </w:p>
+        </w:tc>
+      </w:tr>
+      <w:tr>
+        <w:tc>
+          <w:tcPr>
+            <w:tcW w:type="dxa" w:w="1872"/>
+          </w:tcPr>
+          <w:p>
+            <w:r>
+              <w:rPr>
+                <w:b w:val="false"/>
+                <w:bCs w:val="false"/>
+              </w:rPr>
+              <w:t xml:space="preserve">Tricoma Saude</w:t>
+            </w:r>
+          </w:p>
+        </w:tc>
+        <w:tc>
+          <w:tcPr>
+            <w:tcW w:type="dxa" w:w="1872"/>
+          </w:tcPr>
+          <w:p>
+            <w:r>
+              <w:rPr>
+                <w:b w:val="false"/>
+                <w:bCs w:val="false"/>
+              </w:rPr>
+              <w:t xml:space="preserve">estrutura da planta + saude</w:t>
+            </w:r>
+          </w:p>
+        </w:tc>
+        <w:tc>
+          <w:tcPr>
+            <w:tcW w:type="dxa" w:w="1872"/>
+          </w:tcPr>
+          <w:p>
+            <w:r>
+              <w:rPr>
+                <w:b w:val="false"/>
+                <w:bCs w:val="false"/>
+              </w:rPr>
+              <w:t xml:space="preserve">alto</w:t>
+            </w:r>
+          </w:p>
+        </w:tc>
+        <w:tc>
+          <w:tcPr>
+            <w:tcW w:type="dxa" w:w="1872"/>
+          </w:tcPr>
+          <w:p>
+            <w:r>
+              <w:rPr>
+                <w:b w:val="false"/>
+                <w:bCs w:val="false"/>
+              </w:rPr>
+              <w:t xml:space="preserve">medio</w:t>
+            </w:r>
+          </w:p>
+        </w:tc>
+        <w:tc>
+          <w:tcPr>
+            <w:tcW w:type="dxa" w:w="1872"/>
+          </w:tcPr>
+          <w:p>
+            <w:r>
+              <w:rPr>
+                <w:b w:val="false"/>
+                <w:bCs w:val="false"/>
+              </w:rPr>
+              <w:t xml:space="preserve">alto</w:t>
+            </w:r>
+          </w:p>
+        </w:tc>
+      </w:tr>
+      <w:tr>
+        <w:tc>
+          <w:tcPr>
+            <w:tcW w:type="dxa" w:w="1872"/>
+          </w:tcPr>
+          <w:p>
+            <w:r>
+              <w:rPr>
+                <w:b w:val="false"/>
+                <w:bCs w:val="false"/>
+              </w:rPr>
+              <w:t xml:space="preserve">Cannavida</w:t>
+            </w:r>
+          </w:p>
+        </w:tc>
+        <w:tc>
+          <w:tcPr>
+            <w:tcW w:type="dxa" w:w="1872"/>
+          </w:tcPr>
+          <w:p>
+            <w:r>
+              <w:rPr>
+                <w:b w:val="false"/>
+                <w:bCs w:val="false"/>
+              </w:rPr>
+              <w:t xml:space="preserve">canna + vida</w:t>
+            </w:r>
+          </w:p>
+        </w:tc>
+        <w:tc>
+          <w:tcPr>
+            <w:tcW w:type="dxa" w:w="1872"/>
+          </w:tcPr>
+          <w:p>
+            <w:r>
+              <w:rPr>
+                <w:b w:val="false"/>
+                <w:bCs w:val="false"/>
+              </w:rPr>
+              <w:t xml:space="preserve">alto</w:t>
+            </w:r>
+          </w:p>
+        </w:tc>
+        <w:tc>
+          <w:tcPr>
+            <w:tcW w:type="dxa" w:w="1872"/>
+          </w:tcPr>
+          <w:p>
+            <w:r>
+              <w:rPr>
+                <w:b w:val="false"/>
+                <w:bCs w:val="false"/>
+              </w:rPr>
+              <w:t xml:space="preserve">baixo</w:t>
+            </w:r>
+          </w:p>
+        </w:tc>
+        <w:tc>
+          <w:tcPr>
+            <w:tcW w:type="dxa" w:w="1872"/>
+          </w:tcPr>
+          <w:p>
+            <w:r>
+              <w:rPr>
+                <w:b w:val="false"/>
+                <w:bCs w:val="false"/>
+              </w:rPr>
+              <w:t xml:space="preserve">alto</w:t>
+            </w:r>
+          </w:p>
+        </w:tc>
+      </w:tr>
+      <w:tr>
+        <w:tc>
+          <w:tcPr>
+            <w:tcW w:type="dxa" w:w="1872"/>
+          </w:tcPr>
+          <w:p>
+            <w:r>
+              <w:rPr>
+                <w:b w:val="false"/>
+                <w:bCs w:val="false"/>
+              </w:rPr>
+              <w:t xml:space="preserve">Fitolab Um</w:t>
+            </w:r>
+          </w:p>
+        </w:tc>
+        <w:tc>
+          <w:tcPr>
+            <w:tcW w:type="dxa" w:w="1872"/>
+          </w:tcPr>
+          <w:p>
+            <w:r>
+              <w:rPr>
+                <w:b w:val="false"/>
+                <w:bCs w:val="false"/>
+              </w:rPr>
+              <w:t xml:space="preserve">fito + laboratorio + um</w:t>
+            </w:r>
+          </w:p>
+        </w:tc>
+        <w:tc>
+          <w:tcPr>
+            <w:tcW w:type="dxa" w:w="1872"/>
+          </w:tcPr>
+          <w:p>
+            <w:r>
+              <w:rPr>
+                <w:b w:val="false"/>
+                <w:bCs w:val="false"/>
+              </w:rPr>
+              <w:t xml:space="preserve">medio</w:t>
+            </w:r>
+          </w:p>
+        </w:tc>
+        <w:tc>
+          <w:tcPr>
+            <w:tcW w:type="dxa" w:w="1872"/>
+          </w:tcPr>
+          <w:p>
+            <w:r>
+              <w:rPr>
+                <w:b w:val="false"/>
+                <w:bCs w:val="false"/>
+              </w:rPr>
+              <w:t xml:space="preserve">alto</w:t>
+            </w:r>
+          </w:p>
+        </w:tc>
+        <w:tc>
+          <w:tcPr>
+            <w:tcW w:type="dxa" w:w="1872"/>
+          </w:tcPr>
+          <w:p>
+            <w:r>
+              <w:rPr>
+                <w:b w:val="false"/>
+                <w:bCs w:val="false"/>
+              </w:rPr>
+              <w:t xml:space="preserve">alto</w:t>
+            </w:r>
+          </w:p>
+        </w:tc>
+      </w:tr>
+      <w:tr>
+        <w:tc>
+          <w:tcPr>
+            <w:tcW w:type="dxa" w:w="1872"/>
+          </w:tcPr>
+          <w:p>
+            <w:r>
+              <w:rPr>
+                <w:b w:val="false"/>
+                <w:bCs w:val="false"/>
+              </w:rPr>
+              <w:t xml:space="preserve">Canndata</w:t>
+            </w:r>
+          </w:p>
+        </w:tc>
+        <w:tc>
+          <w:tcPr>
+            <w:tcW w:type="dxa" w:w="1872"/>
+          </w:tcPr>
+          <w:p>
+            <w:r>
+              <w:rPr>
+                <w:b w:val="false"/>
+                <w:bCs w:val="false"/>
+              </w:rPr>
+              <w:t xml:space="preserve">canna + dados</w:t>
+            </w:r>
+          </w:p>
+        </w:tc>
+        <w:tc>
+          <w:tcPr>
+            <w:tcW w:type="dxa" w:w="1872"/>
+          </w:tcPr>
+          <w:p>
+            <w:r>
+              <w:rPr>
+                <w:b w:val="false"/>
+                <w:bCs w:val="false"/>
+              </w:rPr>
+              <w:t xml:space="preserve">alto</w:t>
+            </w:r>
+          </w:p>
+        </w:tc>
+        <w:tc>
+          <w:tcPr>
+            <w:tcW w:type="dxa" w:w="1872"/>
+          </w:tcPr>
+          <w:p>
+            <w:r>
+              <w:rPr>
+                <w:b w:val="false"/>
+                <w:bCs w:val="false"/>
+              </w:rPr>
+              <w:t xml:space="preserve">alto</w:t>
+            </w:r>
+          </w:p>
+        </w:tc>
+        <w:tc>
+          <w:tcPr>
+            <w:tcW w:type="dxa" w:w="1872"/>
+          </w:tcPr>
+          <w:p>
+            <w:r>
+              <w:rPr>
+                <w:b w:val="false"/>
+                <w:bCs w:val="false"/>
+              </w:rPr>
+              <w:t xml:space="preserve">baixo</w:t>
+            </w:r>
+          </w:p>
+        </w:tc>
+      </w:tr>
+      <w:tr>
+        <w:tc>
+          <w:tcPr>
+            <w:tcW w:type="dxa" w:w="1872"/>
+          </w:tcPr>
+          <w:p>
+            <w:r>
+              <w:rPr>
+                <w:b w:val="false"/>
+                <w:bCs w:val="false"/>
+              </w:rPr>
+              <w:t xml:space="preserve">Alquimed</w:t>
+            </w:r>
+          </w:p>
+        </w:tc>
+        <w:tc>
+          <w:tcPr>
+            <w:tcW w:type="dxa" w:w="1872"/>
+          </w:tcPr>
+          <w:p>
+            <w:r>
+              <w:rPr>
+                <w:b w:val="false"/>
+                <w:bCs w:val="false"/>
+              </w:rPr>
+              <w:t xml:space="preserve">alquimia + medicina</w:t>
+            </w:r>
+          </w:p>
+        </w:tc>
+        <w:tc>
+          <w:tcPr>
+            <w:tcW w:type="dxa" w:w="1872"/>
+          </w:tcPr>
+          <w:p>
+            <w:r>
+              <w:rPr>
+                <w:b w:val="false"/>
+                <w:bCs w:val="false"/>
+              </w:rPr>
+              <w:t xml:space="preserve">medio</w:t>
+            </w:r>
+          </w:p>
+        </w:tc>
+        <w:tc>
+          <w:tcPr>
+            <w:tcW w:type="dxa" w:w="1872"/>
+          </w:tcPr>
+          <w:p>
+            <w:r>
+              <w:rPr>
+                <w:b w:val="false"/>
+                <w:bCs w:val="false"/>
+              </w:rPr>
+              <w:t xml:space="preserve">medio</w:t>
+            </w:r>
+          </w:p>
+        </w:tc>
+        <w:tc>
+          <w:tcPr>
+            <w:tcW w:type="dxa" w:w="1872"/>
+          </w:tcPr>
+          <w:p>
+            <w:r>
+              <w:rPr>
+                <w:b w:val="false"/>
+                <w:bCs w:val="false"/>
+              </w:rPr>
+              <w:t xml:space="preserve">alto</w:t>
+            </w:r>
+          </w:p>
+        </w:tc>
+      </w:tr>
+    </w:tbl>
+    <w:p/>
+    <w:p>
+      <w:pPr>
+        <w:spacing w:after="160"/>
+        <w:jc w:val="both"/>
+      </w:pPr>
+      <w:r>
+        <w:t xml:space="preserve">Melhores equilibrios dos tres sinais: </w:t>
+      </w:r>
+      <w:r>
+        <w:rPr>
+          <w:b/>
+          <w:bCs/>
+        </w:rPr>
+        <w:t xml:space="preserve">Canapia</w:t>
+      </w:r>
+      <w:r>
+        <w:t xml:space="preserve">, </w:t>
+      </w:r>
+      <w:r>
+        <w:rPr>
+          <w:b/>
+          <w:bCs/>
+        </w:rPr>
+        <w:t xml:space="preserve">Cannalis</w:t>
+      </w:r>
+      <w:r>
+        <w:t xml:space="preserve"> e </w:t>
+      </w:r>
+      <w:r>
+        <w:rPr>
+          <w:b/>
+          <w:bCs/>
+        </w:rPr>
+        <w:t xml:space="preserve">Tricoma Saude</w:t>
+      </w:r>
+      <w:r>
+        <w:t xml:space="preserve">. Mais tecnologicos: Cannexa, Canndata, Verdegen. Mais saude: Cannavida, Alquimed, Fitolab Um.</w:t>
+      </w:r>
+    </w:p>
+    <w:p>
+      <w:pPr>
+        <w:pStyle w:val="Heading2"/>
+        <w:jc w:val="center"/>
+      </w:pPr>
+      <w:r>
+        <w:rPr>
+          <w:b/>
+          <w:bCs/>
+        </w:rPr>
+        <w:t xml:space="preserve">A jogada profissional: nome distintivo + descritor</w:t>
+      </w:r>
+    </w:p>
+    <w:p>
+      <w:pPr>
+        <w:spacing w:after="160"/>
+        <w:jc w:val="both"/>
+      </w:pPr>
+      <w:r>
+        <w:t xml:space="preserve">Grandes marcas de saude nao colocam a categoria no nome — colocam no descritor que acompanha o logo. Isso entrega os tres sinais SEM os atritos de anuncio/INPI/pagamento:</w:t>
+      </w:r>
+    </w:p>
+    <w:p>
+      <w:pPr>
+        <w:pStyle w:val="ListParagraph"/>
+        <w:numPr>
+          <w:ilvl w:val="0"/>
+          <w:numId w:val="1"/>
+        </w:numPr>
+      </w:pPr>
+      <w:r>
+        <w:rPr>
+          <w:b/>
+          <w:bCs/>
+        </w:rPr>
+        <w:t xml:space="preserve">Alquimia Um — tecnologia em saude canabica</w:t>
+      </w:r>
+    </w:p>
+    <w:p>
+      <w:pPr>
+        <w:pStyle w:val="ListParagraph"/>
+        <w:numPr>
+          <w:ilvl w:val="0"/>
+          <w:numId w:val="1"/>
+        </w:numPr>
+      </w:pPr>
+      <w:r>
+        <w:rPr>
+          <w:b/>
+          <w:bCs/>
+        </w:rPr>
+        <w:t xml:space="preserve">Cinala — cannabis medicinal com evidencia</w:t>
+      </w:r>
+    </w:p>
+    <w:p>
+      <w:pPr>
+        <w:spacing w:after="160"/>
+        <w:jc w:val="both"/>
+      </w:pPr>
+      <w:r>
+        <w:t xml:space="preserve">O descritor aparece no logo, no site, no app e no material de vendas; o nome registravel e "limpo" fica no CNPJ, no INPI e nos gateways. E o melhor dos dois mundos e a recomendacao tecnica deste estudo.</w:t>
       </w:r>
     </w:p>
     <w:p>

</xml_diff>

<commit_message>
Marca: rodada 3 — nomes curtos e memoraveis com teste de grude
Co-Authored-By: Claude <noreply@anthropic.com>
Claude-Session: https://claude.ai/code/session_018WZd4PZy53xqMaYcFDrxLe
</commit_message>
<xml_diff>
--- a/docs/cannabis/ESTUDO_NOMES_MARCA.docx
+++ b/docs/cannabis/ESTUDO_NOMES_MARCA.docx
@@ -1622,6 +1622,395 @@
       </w:pPr>
       <w:r>
         <w:t xml:space="preserve">O descritor aparece no logo, no site, no app e no material de vendas; o nome registravel e "limpo" fica no CNPJ, no INPI e nos gateways. E o melhor dos dois mundos e a recomendacao tecnica deste estudo.</w:t>
+      </w:r>
+    </w:p>
+    <w:p>
+      <w:pPr>
+        <w:pStyle w:val="Heading1"/>
+        <w:jc w:val="center"/>
+      </w:pPr>
+      <w:r>
+        <w:rPr>
+          <w:b/>
+          <w:bCs/>
+        </w:rPr>
+        <w:t xml:space="preserve">Rodada 3 — pedido do dono: facil e que grude</w:t>
+      </w:r>
+    </w:p>
+    <w:p>
+      <w:pPr>
+        <w:spacing w:after="160"/>
+        <w:jc w:val="both"/>
+      </w:pPr>
+      <w:r>
+        <w:t xml:space="preserve">Criterio desta rodada: maximo 3 silabas ou 2 palavras curtas; passa no "teste do telefone" (a pessoa ouve uma vez e escreve certo); passa no "teste do balcao" (da para indicar de boca a um amigo). Sem girias de uso recreativo (verdinha, beck etc.) — matam a credibilidade medica.</w:t>
+      </w:r>
+    </w:p>
+    <w:tbl>
+      <w:tblPr>
+        <w:tblW w:type="dxa" w:w="9360"/>
+        <w:tblBorders>
+          <w:top w:val="single" w:color="auto" w:sz="4"/>
+          <w:left w:val="single" w:color="auto" w:sz="4"/>
+          <w:bottom w:val="single" w:color="auto" w:sz="4"/>
+          <w:right w:val="single" w:color="auto" w:sz="4"/>
+          <w:insideH w:val="single" w:color="auto" w:sz="4"/>
+          <w:insideV w:val="single" w:color="auto" w:sz="4"/>
+        </w:tblBorders>
+      </w:tblPr>
+      <w:tblGrid>
+        <w:gridCol w:w="3120"/>
+        <w:gridCol w:w="3120"/>
+        <w:gridCol w:w="3120"/>
+      </w:tblGrid>
+      <w:tr>
+        <w:tc>
+          <w:tcPr>
+            <w:tcW w:type="dxa" w:w="3120"/>
+          </w:tcPr>
+          <w:p>
+            <w:r>
+              <w:rPr>
+                <w:b/>
+                <w:bCs/>
+              </w:rPr>
+              <w:t xml:space="preserve">Nome</w:t>
+            </w:r>
+          </w:p>
+        </w:tc>
+        <w:tc>
+          <w:tcPr>
+            <w:tcW w:type="dxa" w:w="3120"/>
+          </w:tcPr>
+          <w:p>
+            <w:r>
+              <w:rPr>
+                <w:b/>
+                <w:bCs/>
+              </w:rPr>
+              <w:t xml:space="preserve">Por que gruda</w:t>
+            </w:r>
+          </w:p>
+        </w:tc>
+        <w:tc>
+          <w:tcPr>
+            <w:tcW w:type="dxa" w:w="3120"/>
+          </w:tcPr>
+          <w:p>
+            <w:r>
+              <w:rPr>
+                <w:b/>
+                <w:bCs/>
+              </w:rPr>
+              <w:t xml:space="preserve">Sinais</w:t>
+            </w:r>
+          </w:p>
+        </w:tc>
+      </w:tr>
+      <w:tr>
+        <w:tc>
+          <w:tcPr>
+            <w:tcW w:type="dxa" w:w="3120"/>
+          </w:tcPr>
+          <w:p>
+            <w:r>
+              <w:rPr>
+                <w:b w:val="false"/>
+                <w:bCs w:val="false"/>
+              </w:rPr>
+              <w:t xml:space="preserve">**Alivia**</w:t>
+            </w:r>
+          </w:p>
+        </w:tc>
+        <w:tc>
+          <w:tcPr>
+            <w:tcW w:type="dxa" w:w="3120"/>
+          </w:tcPr>
+          <w:p>
+            <w:r>
+              <w:rPr>
+                <w:b w:val="false"/>
+                <w:bCs w:val="false"/>
+              </w:rPr>
+              <w:t xml:space="preserve">E um verbo-promessa: o produto na propria palavra. "Ja tomou seu Alivia hoje?"</w:t>
+            </w:r>
+          </w:p>
+        </w:tc>
+        <w:tc>
+          <w:tcPr>
+            <w:tcW w:type="dxa" w:w="3120"/>
+          </w:tcPr>
+          <w:p>
+            <w:r>
+              <w:rPr>
+                <w:b w:val="false"/>
+                <w:bCs w:val="false"/>
+              </w:rPr>
+              <w:t xml:space="preserve">saude alta, cannabis implicita</w:t>
+            </w:r>
+          </w:p>
+        </w:tc>
+      </w:tr>
+      <w:tr>
+        <w:tc>
+          <w:tcPr>
+            <w:tcW w:type="dxa" w:w="3120"/>
+          </w:tcPr>
+          <w:p>
+            <w:r>
+              <w:rPr>
+                <w:b w:val="false"/>
+                <w:bCs w:val="false"/>
+              </w:rPr>
+              <w:t xml:space="preserve">**Gota Verde**</w:t>
+            </w:r>
+          </w:p>
+        </w:tc>
+        <w:tc>
+          <w:tcPr>
+            <w:tcW w:type="dxa" w:w="3120"/>
+          </w:tcPr>
+          <w:p>
+            <w:r>
+              <w:rPr>
+                <w:b w:val="false"/>
+                <w:bCs w:val="false"/>
+              </w:rPr>
+              <w:t xml:space="preserve">Concreto e visual: o oleo E uma gota verde. Nome que vira apelido sozinho</w:t>
+            </w:r>
+          </w:p>
+        </w:tc>
+        <w:tc>
+          <w:tcPr>
+            <w:tcW w:type="dxa" w:w="3120"/>
+          </w:tcPr>
+          <w:p>
+            <w:r>
+              <w:rPr>
+                <w:b w:val="false"/>
+                <w:bCs w:val="false"/>
+              </w:rPr>
+              <w:t xml:space="preserve">cannabis media, saude alta</w:t>
+            </w:r>
+          </w:p>
+        </w:tc>
+      </w:tr>
+      <w:tr>
+        <w:tc>
+          <w:tcPr>
+            <w:tcW w:type="dxa" w:w="3120"/>
+          </w:tcPr>
+          <w:p>
+            <w:r>
+              <w:rPr>
+                <w:b w:val="false"/>
+                <w:bCs w:val="false"/>
+              </w:rPr>
+              <w:t xml:space="preserve">**Canapia**</w:t>
+            </w:r>
+          </w:p>
+        </w:tc>
+        <w:tc>
+          <w:tcPr>
+            <w:tcW w:type="dxa" w:w="3120"/>
+          </w:tcPr>
+          <w:p>
+            <w:r>
+              <w:rPr>
+                <w:b w:val="false"/>
+                <w:bCs w:val="false"/>
+              </w:rPr>
+              <w:t xml:space="preserve">Da rodada 2, e a mais facil de falar; soa nome de clinica</w:t>
+            </w:r>
+          </w:p>
+        </w:tc>
+        <w:tc>
+          <w:tcPr>
+            <w:tcW w:type="dxa" w:w="3120"/>
+          </w:tcPr>
+          <w:p>
+            <w:r>
+              <w:rPr>
+                <w:b w:val="false"/>
+                <w:bCs w:val="false"/>
+              </w:rPr>
+              <w:t xml:space="preserve">cannabis alta, saude alta</w:t>
+            </w:r>
+          </w:p>
+        </w:tc>
+      </w:tr>
+      <w:tr>
+        <w:tc>
+          <w:tcPr>
+            <w:tcW w:type="dxa" w:w="3120"/>
+          </w:tcPr>
+          <w:p>
+            <w:r>
+              <w:rPr>
+                <w:b w:val="false"/>
+                <w:bCs w:val="false"/>
+              </w:rPr>
+              <w:t xml:space="preserve">**Cuida**</w:t>
+            </w:r>
+          </w:p>
+        </w:tc>
+        <w:tc>
+          <w:tcPr>
+            <w:tcW w:type="dxa" w:w="3120"/>
+          </w:tcPr>
+          <w:p>
+            <w:r>
+              <w:rPr>
+                <w:b w:val="false"/>
+                <w:bCs w:val="false"/>
+              </w:rPr>
+              <w:t xml:space="preserve">Uma palavra, universal, afetiva</w:t>
+            </w:r>
+          </w:p>
+        </w:tc>
+        <w:tc>
+          <w:tcPr>
+            <w:tcW w:type="dxa" w:w="3120"/>
+          </w:tcPr>
+          <w:p>
+            <w:r>
+              <w:rPr>
+                <w:b w:val="false"/>
+                <w:bCs w:val="false"/>
+              </w:rPr>
+              <w:t xml:space="preserve">saude alta, cannabis baixa</w:t>
+            </w:r>
+          </w:p>
+        </w:tc>
+      </w:tr>
+      <w:tr>
+        <w:tc>
+          <w:tcPr>
+            <w:tcW w:type="dxa" w:w="3120"/>
+          </w:tcPr>
+          <w:p>
+            <w:r>
+              <w:rPr>
+                <w:b w:val="false"/>
+                <w:bCs w:val="false"/>
+              </w:rPr>
+              <w:t xml:space="preserve">**Planta Pura**</w:t>
+            </w:r>
+          </w:p>
+        </w:tc>
+        <w:tc>
+          <w:tcPr>
+            <w:tcW w:type="dxa" w:w="3120"/>
+          </w:tcPr>
+          <w:p>
+            <w:r>
+              <w:rPr>
+                <w:b w:val="false"/>
+                <w:bCs w:val="false"/>
+              </w:rPr>
+              <w:t xml:space="preserve">Aliteracao (P-P) gruda; pureza = laudo</w:t>
+            </w:r>
+          </w:p>
+        </w:tc>
+        <w:tc>
+          <w:tcPr>
+            <w:tcW w:type="dxa" w:w="3120"/>
+          </w:tcPr>
+          <w:p>
+            <w:r>
+              <w:rPr>
+                <w:b w:val="false"/>
+                <w:bCs w:val="false"/>
+              </w:rPr>
+              <w:t xml:space="preserve">cannabis alta, saude media</w:t>
+            </w:r>
+          </w:p>
+        </w:tc>
+      </w:tr>
+    </w:tbl>
+    <w:p/>
+    <w:p>
+      <w:pPr>
+        <w:spacing w:after="160"/>
+        <w:jc w:val="both"/>
+      </w:pPr>
+      <w:r>
+        <w:t xml:space="preserve">Ranking de "grude" (memorabilidade estimada): 1. Gota Verde,</w:t>
+      </w:r>
+    </w:p>
+    <w:p>
+      <w:pPr>
+        <w:spacing w:after="120"/>
+        <w:ind w:left="360"/>
+      </w:pPr>
+      <w:r>
+        <w:rPr>
+          <w:b/>
+          <w:bCs/>
+        </w:rPr>
+        <w:t xml:space="preserve">2. </w:t>
+      </w:r>
+      <w:r>
+        <w:t xml:space="preserve">Alivia, 3. Cuida, 4. Canapia, 5. Planta Pura.</w:t>
+      </w:r>
+    </w:p>
+    <w:p>
+      <w:pPr>
+        <w:spacing w:after="160"/>
+        <w:jc w:val="both"/>
+      </w:pPr>
+      <w:r>
+        <w:t xml:space="preserve">Cruzando com as lentes anteriores (INPI, anuncios, extensao de marca):</w:t>
+      </w:r>
+    </w:p>
+    <w:p>
+      <w:pPr>
+        <w:pStyle w:val="ListParagraph"/>
+        <w:numPr>
+          <w:ilvl w:val="0"/>
+          <w:numId w:val="1"/>
+        </w:numPr>
+      </w:pPr>
+      <w:r>
+        <w:rPr>
+          <w:b/>
+          <w:bCs/>
+        </w:rPr>
+        <w:t xml:space="preserve">Gota Verde</w:t>
+      </w:r>
+      <w:r>
+        <w:t xml:space="preserve"> — o mais grudento e visual; logo obvio (uma gota); estende bem (Gota Verde Pet, Gota Verde Clinica). Risco: registrar marca com palavras comuns exige conjunto distintivo — viavel, conferir INPI classe 5.</w:t>
+      </w:r>
+    </w:p>
+    <w:p>
+      <w:pPr>
+        <w:pStyle w:val="ListParagraph"/>
+        <w:numPr>
+          <w:ilvl w:val="0"/>
+          <w:numId w:val="1"/>
+        </w:numPr>
+      </w:pPr>
+      <w:r>
+        <w:rPr>
+          <w:b/>
+          <w:bCs/>
+        </w:rPr>
+        <w:t xml:space="preserve">Alivia</w:t>
+      </w:r>
+      <w:r>
+        <w:t xml:space="preserve"> — promessa dentro do nome; cuidado unico: nao pode virar promessa terapeutica explicita em anuncio (a marca alivia, nao cura).</w:t>
+      </w:r>
+    </w:p>
+    <w:p>
+      <w:pPr>
+        <w:pStyle w:val="ListParagraph"/>
+        <w:numPr>
+          <w:ilvl w:val="0"/>
+          <w:numId w:val="1"/>
+        </w:numPr>
+      </w:pPr>
+      <w:r>
+        <w:t xml:space="preserve">Os dois funcionam com o descritor: "Gota Verde — cannabis medicinal com evidencia" / "Alivia — tecnologia em saude canabica".</w:t>
       </w:r>
     </w:p>
     <w:p>

</xml_diff>